<commit_message>
Mobile: Partial css adaption
</commit_message>
<xml_diff>
--- a/referenceMaterial/contemporaryReferences.docx
+++ b/referenceMaterial/contemporaryReferences.docx
@@ -8700,15 +8700,40 @@
         <w:bidi w:val="0"/>
         <w:jc w:val="start"/>
         <w:rPr>
-          <w:b/>
-          <w:bCs/>
-        </w:rPr>
-      </w:pPr>
-      <w:r>
-        <w:rPr>
-          <w:b/>
-          <w:bCs/>
-        </w:rPr>
+          <w:b w:val="false"/>
+          <w:bCs w:val="false"/>
+        </w:rPr>
+      </w:pPr>
+      <w:r>
+        <w:rPr>
+          <w:b w:val="false"/>
+          <w:bCs w:val="false"/>
+        </w:rPr>
+        <w:t>* Life</w:t>
+      </w:r>
+    </w:p>
+    <w:p>
+      <w:pPr>
+        <w:pStyle w:val="Normal"/>
+        <w:bidi w:val="0"/>
+        <w:jc w:val="start"/>
+        <w:rPr>
+          <w:rFonts w:ascii="Times New Roman" w:hAnsi="Times New Roman" w:cs="Times New Roman"/>
+          <w:b/>
+          <w:bCs/>
+          <w:sz w:val="24"/>
+          <w:szCs w:val="24"/>
+        </w:rPr>
+      </w:pPr>
+      <w:r>
+        <w:rPr>
+          <w:rFonts w:cs="Times New Roman" w:ascii="Times New Roman" w:hAnsi="Times New Roman"/>
+          <w:b/>
+          <w:bCs/>
+          <w:sz w:val="24"/>
+          <w:szCs w:val="24"/>
+        </w:rPr>
+        <w:t>Marty Supreme</w:t>
       </w:r>
     </w:p>
     <w:p>
@@ -8857,27 +8882,7 @@
           <w:sz w:val="24"/>
           <w:szCs w:val="24"/>
         </w:rPr>
-        <w:t xml:space="preserve"> Planck constants. Basil </w:t>
-      </w:r>
-      <w:r>
-        <w:rPr>
-          <w:rFonts w:cs="Times New Roman" w:ascii="Times New Roman" w:hAnsi="Times New Roman"/>
-          <w:b w:val="false"/>
-          <w:bCs w:val="false"/>
-          <w:sz w:val="24"/>
-          <w:szCs w:val="24"/>
-        </w:rPr>
-        <w:t xml:space="preserve">and </w:t>
-      </w:r>
-      <w:r>
-        <w:rPr>
-          <w:rFonts w:cs="Times New Roman" w:ascii="Times New Roman" w:hAnsi="Times New Roman"/>
-          <w:b w:val="false"/>
-          <w:bCs w:val="false"/>
-          <w:sz w:val="24"/>
-          <w:szCs w:val="24"/>
-        </w:rPr>
-        <w:t>Watson wear pirate costumes before getting caught, “walk the plank”.</w:t>
+        <w:t xml:space="preserve"> Planck constants. Basil and Watson wear pirate costumes before getting caught, “walk the plank”.</w:t>
       </w:r>
     </w:p>
     <w:p>
@@ -10209,28 +10214,46 @@
           <w:sz w:val="24"/>
           <w:szCs w:val="24"/>
         </w:rPr>
-        <w:t>* About psychological problems</w:t>
-      </w:r>
-    </w:p>
-    <w:p>
-      <w:pPr>
-        <w:pStyle w:val="Normal"/>
-        <w:bidi w:val="0"/>
-        <w:jc w:val="start"/>
-        <w:rPr>
-          <w:b/>
-          <w:bCs/>
-        </w:rPr>
-      </w:pPr>
-      <w:r>
-        <w:rPr>
-          <w:rFonts w:cs="Times New Roman" w:ascii="Times New Roman" w:hAnsi="Times New Roman"/>
-          <w:b/>
-          <w:bCs/>
-          <w:sz w:val="24"/>
-          <w:szCs w:val="24"/>
-        </w:rPr>
-        <w:t>American Psycho</w:t>
+        <w:t xml:space="preserve">* </w:t>
+      </w:r>
+      <w:r>
+        <w:rPr>
+          <w:rFonts w:cs="Times New Roman" w:ascii="Times New Roman" w:hAnsi="Times New Roman"/>
+          <w:sz w:val="24"/>
+          <w:szCs w:val="24"/>
+        </w:rPr>
+        <w:t>PS</w:t>
+      </w:r>
+      <w:r>
+        <w:rPr>
+          <w:rFonts w:cs="Times New Roman" w:ascii="Times New Roman" w:hAnsi="Times New Roman"/>
+          <w:sz w:val="24"/>
+          <w:szCs w:val="24"/>
+        </w:rPr>
+        <w:t>sychological problems</w:t>
+      </w:r>
+    </w:p>
+    <w:p>
+      <w:pPr>
+        <w:pStyle w:val="Normal"/>
+        <w:bidi w:val="0"/>
+        <w:jc w:val="start"/>
+        <w:rPr>
+          <w:b/>
+          <w:bCs/>
+        </w:rPr>
+      </w:pPr>
+      <w:r>
+        <w:rPr>
+          <w:rFonts w:cs="Times New Roman" w:ascii="Times New Roman" w:hAnsi="Times New Roman"/>
+          <w:b/>
+          <w:bCs/>
+          <w:sz w:val="24"/>
+          <w:szCs w:val="24"/>
+        </w:rPr>
+        <w:t>America</w:t>
+        <w:tab/>
+        <w:t>n Psycho</w:t>
       </w:r>
     </w:p>
     <w:p>
@@ -10411,6 +10434,36 @@
           <w:szCs w:val="24"/>
         </w:rPr>
         <w:t>* Going to look at my phone for a bit...</w:t>
+      </w:r>
+    </w:p>
+    <w:p>
+      <w:pPr>
+        <w:pStyle w:val="Normal"/>
+        <w:bidi w:val="0"/>
+        <w:jc w:val="start"/>
+        <w:rPr>
+          <w:rFonts w:ascii="Times New Roman" w:hAnsi="Times New Roman" w:cs="Times New Roman"/>
+          <w:sz w:val="24"/>
+          <w:szCs w:val="24"/>
+        </w:rPr>
+      </w:pPr>
+      <w:r>
+        <w:rPr>
+          <w:rFonts w:cs="Times New Roman" w:ascii="Times New Roman" w:hAnsi="Times New Roman"/>
+          <w:b/>
+          <w:bCs/>
+          <w:sz w:val="24"/>
+          <w:szCs w:val="24"/>
+        </w:rPr>
+        <w:t>Transcendence</w:t>
+      </w:r>
+      <w:r>
+        <w:rPr>
+          <w:rFonts w:cs="Times New Roman" w:ascii="Times New Roman" w:hAnsi="Times New Roman"/>
+          <w:sz w:val="24"/>
+          <w:szCs w:val="24"/>
+        </w:rPr>
+        <w:t xml:space="preserve"> </w:t>
       </w:r>
     </w:p>
     <w:p>
@@ -12657,8 +12710,8 @@
       <w:szCs w:val="48"/>
     </w:rPr>
   </w:style>
-  <w:style w:type="character" w:styleId="Bulletsuser">
-    <w:name w:val="Bullets (user)"/>
+  <w:style w:type="character" w:styleId="Bullets">
+    <w:name w:val="Bullets"/>
     <w:qFormat/>
     <w:rPr>
       <w:rFonts w:ascii="OpenSymbol" w:hAnsi="OpenSymbol" w:eastAsia="OpenSymbol" w:cs="OpenSymbol"/>
@@ -12672,8 +12725,8 @@
       <w:bCs/>
     </w:rPr>
   </w:style>
-  <w:style w:type="character" w:styleId="Bullets">
-    <w:name w:val="Bullets"/>
+  <w:style w:type="character" w:styleId="Bulletsuser">
+    <w:name w:val="Bullets (user)"/>
     <w:qFormat/>
     <w:rPr>
       <w:rFonts w:ascii="OpenSymbol" w:hAnsi="OpenSymbol" w:eastAsia="OpenSymbol" w:cs="OpenSymbol"/>

</xml_diff>